<commit_message>
Raise the Calibre Verdict fee to USD 6,000
Rate card, service definition, time log, READMEs and the decisions log now
carry USD 6,000 with the 50/50 terms unchanged. At the USD 350 hurdle the
fee buys 17.1 all-in hours against the 15.75-hour budget. The market
rationale (product/PRICING.md) follows in the next commit.

Co-Authored-By: Claude Opus 5.5 <noreply@anthropic.com>
Claude-Session: https://claude.ai/code/session_01BTLr4iYcvkGMcb7AZEM3uQ
</commit_message>
<xml_diff>
--- a/kit/Calibre_Service_Definition.docx
+++ b/kit/Calibre_Service_Definition.docx
@@ -472,7 +472,7 @@
                 <w:sz w:val="19"/>
                 <w:szCs w:val="19"/>
               </w:rPr>
-              <w:t xml:space="preserve">USD 5,500 fixed. 50% on criteria lock, 50% on delivery of the written Verdict.</w:t>
+              <w:t xml:space="preserve">USD 6,000 fixed. 50% on criteria lock, 50% on delivery of the written Verdict.</w:t>
             </w:r>
           </w:p>
         </w:tc>
@@ -2659,7 +2659,7 @@
                 <w:sz w:val="19"/>
                 <w:szCs w:val="19"/>
               </w:rPr>
-              <w:t xml:space="preserve">USD 5,500 fixed; 50% on criteria lock, 50% on delivery. Currency and confidentiality terms are confirmed in the signed engagement letter.</w:t>
+              <w:t xml:space="preserve">USD 6,000 fixed; 50% on criteria lock, 50% on delivery. Currency and confidentiality terms are confirmed in the signed engagement letter.</w:t>
             </w:r>
           </w:p>
         </w:tc>

</xml_diff>